<commit_message>
Corregir la descripción de la muestra: 167 expedientes anulados o revocados
Según la Tabla 3 y el Excel, los 167 expedientes (87/80) no son todos
nulos: 113 tienen la sentencia anulada y 54 revocada. Los nulos son las
105 sentencias de vista de la Tabla 6 (53/52). Se ajustan las marcas y
el informe en ese sentido.

Co-Authored-By: Claude Opus 5.5 <noreply@anthropic.com>
Claude-Session: https://claude.ai/code/session_01XFuYzN9DHY2Hj3pMHx8UWS
</commit_message>
<xml_diff>
--- a/INFORME_COHERENCIA_Y_PROPUESTA_RECOMENDACIONES.docx
+++ b/INFORME_COHERENCIA_Y_PROPUESTA_RECOMENDACIONES.docx
@@ -1078,7 +1078,7 @@
         <w:rPr>
           <w:rFonts w:ascii="Arial" w:cs="Arial" w:eastAsia="Arial" w:hAnsi="Arial"/>
         </w:rPr>
-        <w:t xml:space="preserve">Hablan de 100 expedientes (43/57) y 113 sentencias de vista, y de una concentración que va del 20,9 % al 77,2 %. Los Resultados trabajan con 167 expedientes nulos (87/80), 163 sentencias de vista (105 anuladas: 53/52) y una concentración del 20,7 % al 71,3 %. Casi todas las cifras de Aportes y Conclusiones deben reemplazarse (Parte B).</w:t>
+        <w:t xml:space="preserve">Hablan de 100 expedientes (43/57) y 113 sentencias de vista, y de una concentración que va del 20,9 % al 77,2 %. Los Resultados trabajan con 167 expedientes con sentencia anulada o revocada (87/80), 163 sentencias de vista (105 anuladas: 53/52) y una concentración del 20,7 % al 71,3 %. Casi todas las cifras de Aportes y Conclusiones deben reemplazarse (Parte B).</w:t>
       </w:r>
     </w:p>
     <w:p>
@@ -1097,13 +1097,13 @@
           <w:b/>
           <w:bCs/>
         </w:rPr>
-        <w:t xml:space="preserve">La muestra está formada por expedientes nulos, pero ningún documento lo dice. </w:t>
+        <w:t xml:space="preserve">La muestra está formada solo por expedientes con sentencia censurada, pero ningún documento lo dice. </w:t>
       </w:r>
       <w:r>
         <w:rPr>
           <w:rFonts w:ascii="Arial" w:cs="Arial" w:eastAsia="Arial" w:hAnsi="Arial"/>
         </w:rPr>
-        <w:t xml:space="preserve">Los 167 expedientes (87/80) tienen su sentencia de primera instancia anulada. Por eso los indicadores de oralidad (Tabla 4) y el control superior (Tabla 5) describen expedientes con nulidad, no todos los procesos, y las proporciones de anuladas, revocadas o confirmadas dentro de la muestra no pueden compararse entre grupos. Hay que declararlo en Resultados, Discusión, Aportes y Conclusiones, y explicar por qué las Tablas 3 y 5 muestran revocadas y confirmadas en expedientes nulos (marcas R-02 y R-03).</w:t>
+        <w:t xml:space="preserve">Según la Tabla 3, los 167 expedientes (87/80) son 113 anulados (55 y 58) y 54 revocados (32 y 22). No todos son nulos: los nulos son las 105 sentencias de vista de la Tabla 6 (53 y 52). Como la muestra se eligió por su resultado adverso, los indicadores de oralidad (Tabla 4) y el control superior (Tabla 5) describen procesos censurados, no todos los procesos, y las proporciones de anuladas, revocadas o confirmadas dentro de la muestra no pueden compararse entre grupos. Hay que declararlo en Resultados, Discusión, Aportes y Conclusiones (marcas R-02 y R-03).</w:t>
       </w:r>
     </w:p>
     <w:p>
@@ -1308,7 +1308,7 @@
         <w:rPr>
           <w:rFonts w:ascii="Arial" w:cs="Arial" w:eastAsia="Arial" w:hAnsi="Arial"/>
         </w:rPr>
-        <w:t xml:space="preserve">Declarar en todos los documentos que los 167 expedientes son nulos y explicar en nota qué nulidad los define y qué pronunciamiento registran las Tablas 3 (hito SIJ: 55/58 anuladas, 32/22 revocadas) y 5 (53/52 anuladas, 29/24 revocadas, 1/1 confirmadas).</w:t>
+        <w:t xml:space="preserve">Declarar en todos los documentos que los 167 expedientes tienen sentencia anulada o revocada (113 anulados y 54 revocados según el SIJ) y explicar en nota por qué la Tabla 3 (55/58 anuladas, 32/22 revocadas) no coincide con la Tabla 5 (53/52 anuladas, 29/24 revocadas, 1/1 confirmadas).</w:t>
       </w:r>
     </w:p>
     <w:p>
@@ -1602,7 +1602,7 @@
                 <w:sz w:val="18"/>
                 <w:szCs w:val="18"/>
               </w:rPr>
-              <w:t xml:space="preserve">Expedientes nulos: sentencia de 1.ª instancia anulada (muestra documental)</w:t>
+              <w:t xml:space="preserve">Expedientes con sentencia de 1.ª instancia anulada o revocada (muestra documental)</w:t>
             </w:r>
           </w:p>
         </w:tc>
@@ -1635,7 +1635,7 @@
                 <w:sz w:val="18"/>
                 <w:szCs w:val="18"/>
               </w:rPr>
-              <w:t xml:space="preserve">87</w:t>
+              <w:t xml:space="preserve">87 (55 anul. + 32 rev.)</w:t>
             </w:r>
           </w:p>
         </w:tc>
@@ -1668,7 +1668,7 @@
                 <w:sz w:val="18"/>
                 <w:szCs w:val="18"/>
               </w:rPr>
-              <w:t xml:space="preserve">80</w:t>
+              <w:t xml:space="preserve">80 (58 anul. + 22 rev.)</w:t>
             </w:r>
           </w:p>
         </w:tc>
@@ -6523,7 +6523,7 @@
                 <w:sz w:val="18"/>
                 <w:szCs w:val="18"/>
               </w:rPr>
-              <w:t xml:space="preserve">167 expedientes nulos (87/80); 163 sentencias de vista; 105 anuladas (53/52)</w:t>
+              <w:t xml:space="preserve">167 expedientes con sentencia anulada o revocada (87/80); 163 sentencias de vista; 105 anuladas (53/52)</w:t>
             </w:r>
           </w:p>
         </w:tc>
@@ -8363,7 +8363,7 @@
         <w:rPr>
           <w:rFonts w:ascii="Arial" w:cs="Arial" w:eastAsia="Arial" w:hAnsi="Arial"/>
         </w:rPr>
-        <w:t xml:space="preserve">El Modelo de Oralidad Civil implementado en los Juzgados Civiles de la Sede Central de Arequipa hizo operativo el principio de concentración con mayor intensidad que sus demás componentes. En los 167 expedientes nulos analizados, el saneamiento procesal, la fijación de puntos controvertidos y la admisión de medios probatorios en un solo acto se acreditaron en el 71,3 % de los expedientes del grupo Oralidad (57 de 80), frente al 20,7 % del grupo Tradicional (18 de 87), una diferencia de 50,6 puntos porcentuales. En cambio, la fijación expresa de hechos no controvertidos solo alcanzó el 16,3 %, la sentencia expedida en audiencia el 5,0 % y la lectura oral del sentido del fallo el 2,5 %, y no se computaron convenciones probatorias en ningún grupo; además, persistieron suspensiones, continuaciones de audiencia e incidentes. Como los principios de concentración e inmediación rigen desde 1993 en el Título Preliminar del Código Procesal Civil, la diferencia no obedece a un cambio del texto legal: es compatible con el protocolo de audiencia y la organización del módulo, sin que el diseño documental permita atribuirla exclusivamente a las resoluciones administrativas que lo regulan.</w:t>
+        <w:t xml:space="preserve">El Modelo de Oralidad Civil implementado en los Juzgados Civiles de la Sede Central de Arequipa hizo operativo el principio de concentración con mayor intensidad que sus demás componentes. En los 167 expedientes analizados, todos con sentencia anulada o revocada en segunda instancia, el saneamiento procesal, la fijación de puntos controvertidos y la admisión de medios probatorios en un solo acto se acreditaron en el 71,3 % de los expedientes del grupo Oralidad (57 de 80), frente al 20,7 % del grupo Tradicional (18 de 87), una diferencia de 50,6 puntos porcentuales. En cambio, la fijación expresa de hechos no controvertidos solo alcanzó el 16,3 %, la sentencia expedida en audiencia el 5,0 % y la lectura oral del sentido del fallo el 2,5 %, y no se computaron convenciones probatorias en ningún grupo; además, persistieron suspensiones, continuaciones de audiencia e incidentes. Como los principios de concentración e inmediación rigen desde 1993 en el Título Preliminar del Código Procesal Civil, la diferencia no obedece a un cambio del texto legal: es compatible con el protocolo de audiencia y la organización del módulo, sin que el diseño documental permita atribuirla exclusivamente a las resoluciones administrativas que lo regulan.</w:t>
       </w:r>
     </w:p>
     <w:p>
@@ -8423,7 +8423,7 @@
         <w:rPr>
           <w:rFonts w:ascii="Arial" w:cs="Arial" w:eastAsia="Arial" w:hAnsi="Arial"/>
         </w:rPr>
-        <w:t xml:space="preserve">En consecuencia, la efectividad del Modelo de Oralidad Civil en las sentencias de los Juzgados Civiles de la Sede Central de Arequipa es positiva, parcial y diferenciada, por lo que la hipótesis se considera parcialmente comprobada. Se verifica en la dimensión organizativa (concentración) y, en menor medida, en la estabilidad de las sentencias frente a la revisión superior, pero no en la dimensión decisoria (emisión oral del fallo) ni en la calidad de la motivación de las sentencias anuladas. Como la muestra documental está formada por expedientes nulos, estos hallazgos describen el funcionamiento del modelo en los procesos que terminaron en nulidad y no pueden extenderse sin más a la totalidad de procesos. El margen de mejora pendiente se ubica en el registro de la audiencia, en la trazabilidad de la prueba admitida hasta su valoración y en la suficiencia de la motivación, antes que en una modificación del texto legal.</w:t>
+        <w:t xml:space="preserve">En consecuencia, la efectividad del Modelo de Oralidad Civil en las sentencias de los Juzgados Civiles de la Sede Central de Arequipa es positiva, parcial y diferenciada, por lo que la hipótesis se considera parcialmente comprobada. Se verifica en la dimensión organizativa (concentración) y, en menor medida, en la estabilidad de las sentencias frente a la revisión superior, pero no en la dimensión decisoria (emisión oral del fallo) ni en la calidad de la motivación de las sentencias anuladas. Como la muestra documental está formada por expedientes cuya sentencia fue anulada o revocada, estos hallazgos describen el funcionamiento del modelo en los procesos censurados en segunda instancia y no pueden extenderse sin más a la totalidad de procesos. El margen de mejora pendiente se ubica en el registro de la audiencia, en la trazabilidad de la prueba admitida hasta su valoración y en la suficiencia de la motivación, antes que en una modificación del texto legal.</w:t>
       </w:r>
     </w:p>
     <w:p>
@@ -8656,7 +8656,7 @@
         <w:rPr>
           <w:rFonts w:ascii="Arial" w:cs="Arial" w:eastAsia="Arial" w:hAnsi="Arial"/>
         </w:rPr>
-        <w:t xml:space="preserve">Se recomienda a los investigadores que continúen esta línea de estudio: a) recodificar en los supuestos a) a e) de la tipología Llamoja las diecinueve resoluciones que permanecen en la categoría residual; b) incorporar a la ficha un indicador expreso de concordancia entre lo saneado, lo actuado y lo valorado; c) ampliar la muestra a expedientes no anulados, para contrastar si los indicadores de oralidad difieren entre procesos con y sin nulidad; d) comparar grupos equivalentes por vía procesal o ajustar los resultados por esa variable; e) reconstruir la cronología completa de cada expediente, incluidos los reenvíos; y f) complementar el análisis documental con entrevistas a jueces, abogados y servidores judiciales, de modo que la triangulación metodológica sea completa.</w:t>
+        <w:t xml:space="preserve">Se recomienda a los investigadores que continúen esta línea de estudio: a) recodificar en los supuestos a) a e) de la tipología Llamoja las diecinueve resoluciones que permanecen en la categoría residual; b) incorporar a la ficha un indicador expreso de concordancia entre lo saneado, lo actuado y lo valorado; c) ampliar la muestra a expedientes con sentencia confirmada, para contrastar si los indicadores de oralidad difieren entre procesos censurados y no censurados; d) comparar grupos equivalentes por vía procesal o ajustar los resultados por esa variable; e) reconstruir la cronología completa de cada expediente, incluidos los reenvíos; y f) complementar el análisis documental con entrevistas a jueces, abogados y servidores judiciales, de modo que la triangulación metodológica sea completa.</w:t>
       </w:r>
     </w:p>
     <w:p>
@@ -9769,7 +9769,7 @@
                 <w:sz w:val="18"/>
                 <w:szCs w:val="18"/>
               </w:rPr>
-              <w:t xml:space="preserve">Muestra solo de expedientes nulos; 19 resoluciones residuales g); grupos no equivalentes por vía; sin triangulación metodológica</w:t>
+              <w:t xml:space="preserve">Muestra solo de expedientes con sentencia anulada o revocada; 19 resoluciones residuales g); grupos no equivalentes por vía; sin triangulación metodológica</w:t>
             </w:r>
           </w:p>
         </w:tc>
@@ -9928,7 +9928,7 @@
         <w:rPr>
           <w:rFonts w:ascii="Arial" w:cs="Arial" w:eastAsia="Arial" w:hAnsi="Arial"/>
         </w:rPr>
-        <w:t xml:space="preserve">la Segunda (cubre el hallazgo principal del segundo objetivo: más motivación insuficiente y más omisión de valoración), la Tercera (la anulación no bajó), la Quinta (dimensión decisoria) y la Séptima (limitaciones: muestra de expedientes nulos y las declaradas en la matriz de Denzin).</w:t>
+        <w:t xml:space="preserve">la Segunda (cubre el hallazgo principal del segundo objetivo: más motivación insuficiente y más omisión de valoración), la Tercera (la anulación no bajó), la Quinta (dimensión decisoria) y la Séptima (limitaciones: muestra de expedientes con sentencia censurada y las declaradas en la matriz de Denzin).</w:t>
       </w:r>
     </w:p>
     <w:p>
@@ -10572,7 +10572,7 @@
                 <w:sz w:val="15"/>
                 <w:szCs w:val="15"/>
               </w:rPr>
-              <w:t xml:space="preserve">El texto no dice que los 167 expedientes (87/80) son expedientes NULOS, es decir, que su sentencia de primera instancia fue anulada. Ese es el criterio de selección de la muestra y condiciona todos los resultados: los indicadores de oralidad (Tabla 4) y el control superior (Tabla 5) se miden solo en expedientes con nulidad, no en el conjunto de procesos. Sin esa precisión, Aportes y Conclusiones generalizan al modelo en su conjunto.</w:t>
+              <w:t xml:space="preserve">El texto no dice que la muestra está formada solo por expedientes cuya sentencia de primera instancia fue CENSURADA en segunda instancia. Según la Tabla 3, los 167 expedientes (87/80) son 113 anulados (55 y 58) y 54 revocados (32 y 22); ninguno fue confirmado. No son todos nulos: los nulos son las 105 sentencias de vista de la Tabla 6 (53 y 52). Como la muestra se eligió por su resultado adverso, los indicadores de oralidad (Tabla 4) y el control superior (Tabla 5) describen procesos censurados, no el conjunto de procesos. Sin esta precisión, Aportes y Conclusiones generalizan al modelo en su conjunto.</w:t>
             </w:r>
           </w:p>
         </w:tc>
@@ -10605,7 +10605,7 @@
                 <w:sz w:val="15"/>
                 <w:szCs w:val="15"/>
               </w:rPr>
-              <w:t xml:space="preserve">Tablas 3, 4 y 5 (que se leen como si fueran una muestra general) y archivo APORTES (§ 1, § 5 y Conclusiones).</w:t>
+              <w:t xml:space="preserve">Tabla 3 (55/58 anuladas y 32/22 revocadas), Tabla 5 y archivo APORTES (§ 1, § 5 y Conclusiones).</w:t>
             </w:r>
           </w:p>
         </w:tc>
@@ -10638,7 +10638,7 @@
                 <w:sz w:val="15"/>
                 <w:szCs w:val="15"/>
               </w:rPr>
-              <w:t xml:space="preserve">«Para el análisis documental se revisaron 167 expedientes nulos, esto es, expedientes cuya sentencia de primera instancia fue anulada por la Sala Civil: 87 del grupo Tradicional y 80 del grupo Oralidad. Los indicadores de las Tablas 4 y 5 se refieren, por tanto, a expedientes con nulidad y no a la totalidad de procesos tramitados en cada período.» Repetir la precisión en la nota de las Tablas 3 y 4 y donde se mencionen los 167 expedientes (1.1, 2.8 y Discusión).</w:t>
+              <w:t xml:space="preserve">«Para el análisis documental se revisaron 167 expedientes cuya sentencia de primera instancia fue anulada o revocada en segunda instancia: 87 del grupo Tradicional (55 anulados y 32 revocados) y 80 del grupo Oralidad (58 anulados y 22 revocados), según el hito registrado en el SIJ. Los indicadores de las Tablas 4 y 5 se refieren, por tanto, a procesos cuya sentencia fue censurada y no a la totalidad de procesos tramitados en cada período.» Usar la misma fórmula donde se mencionen los 167 expedientes (1.1, 2.8 y Discusión).</w:t>
             </w:r>
           </w:p>
         </w:tc>
@@ -10776,7 +10776,7 @@
                 <w:sz w:val="15"/>
                 <w:szCs w:val="15"/>
               </w:rPr>
-              <w:t xml:space="preserve">Si los 167 expedientes son todos expedientes nulos, el lector espera ver solo anulaciones. Sin embargo, la Tabla 3 registra 55/58 anuladas y 32/22 revocadas sobre 87/80, y la Tabla 5 registra 53/52 anuladas, 29/24 revocadas y 1/1 confirmadas sobre 85/78. Además, para el grupo Oralidad aparecen dos cifras de anulación distintas (58 y 52). Nada de esto se explica.</w:t>
+              <w:t xml:space="preserve">La Tabla 3 registra 55/58 anuladas y 32/22 revocadas (sin confirmadas) sobre 87/80. La Tabla 5 registra 53/52 anuladas, 29/24 revocadas y 1/1 confirmadas sobre 85/78. Así, para el grupo Oralidad aparecen dos cifras de anulación distintas (58 y 52), y la Tabla 5 incluye dos confirmadas en una muestra que, según el SIJ, solo tiene anulados y revocados. Nada de esto se explica.</w:t>
             </w:r>
           </w:p>
         </w:tc>
@@ -10842,7 +10842,7 @@
                 <w:sz w:val="15"/>
                 <w:szCs w:val="15"/>
               </w:rPr>
-              <w:t xml:space="preserve">Añadir nota a las Tablas 3 y 5 que explique qué nulidad define al expediente como «nulo» (p. ej., la de la primera sentencia) y qué pronunciamiento se registra en la tabla (p. ej., la última sentencia de vista o hito del SIJ), de modo que se entienda por qué aparecen revocadas y confirmadas en expedientes nulos y por qué 58 ≠ 52. (Verificar la explicación en la base.) Precisar que, como la muestra se seleccionó por nulidad, la proporción de anuladas, revocadas o confirmadas dentro de ella no es un resultado comparable entre grupos.</w:t>
+              <w:t xml:space="preserve">Añadir nota a la Tabla 3: «El hito del SIJ registra el último movimiento de segunda instancia del expediente; la Tabla 5 clasifica el pronunciamiento de la sentencia de vista efectivamente obtenida (85 y 78 documentos disponibles). Por ello las cifras no coinciden y no deben sustituirse entre sí.» (Verificar la explicación en la base, en especial las dos confirmadas.) Precisar además que, como la muestra se seleccionó por su resultado adverso, la proporción de anuladas, revocadas o confirmadas dentro de ella no es un resultado comparable entre grupos.</w:t>
             </w:r>
           </w:p>
         </w:tc>
@@ -19892,7 +19892,7 @@
                 <w:sz w:val="15"/>
                 <w:szCs w:val="15"/>
               </w:rPr>
-              <w:t xml:space="preserve">«El análisis se practicó sobre ciento sesenta y siete (167) expedientes civiles nulos, cuya sentencia de primera instancia fue anulada por la Sala Civil —ochenta y siete (87) del grupo Tradicional y ochenta (80) del grupo Oralidad—, sobre ciento sesenta y tres (163) sentencias de vista, de las cuales ciento cinco (105) declararon la nulidad (53 y 52), y sobre las series anuales de sentencias de segunda instancia de 2018 (281) y 2024 (328)».</w:t>
+              <w:t xml:space="preserve">«El análisis se practicó sobre ciento sesenta y siete (167) expedientes civiles cuya sentencia de primera instancia fue anulada o revocada en segunda instancia —ochenta y siete (87) del grupo Tradicional y ochenta (80) del grupo Oralidad—, sobre ciento sesenta y tres (163) sentencias de vista, de las cuales ciento cinco (105) declararon la nulidad (53 y 52), y sobre las series anuales de sentencias de segunda instancia de 2018 (281) y 2024 (328)».</w:t>
             </w:r>
           </w:p>
         </w:tc>
@@ -22340,7 +22340,7 @@
                 <w:sz w:val="15"/>
                 <w:szCs w:val="15"/>
               </w:rPr>
-              <w:t xml:space="preserve">«El aporte empírico consiste en una medición sistemática, en el ámbito de la Sede Central de Arequipa, del efecto del Modelo de Oralidad Civil sobre el producto final del proceso, con base en 167 expedientes nulos, 163 sentencias de vista (105 anuladas) y las series anuales de 2018 y 2024:»</w:t>
+              <w:t xml:space="preserve">«El aporte empírico consiste en una medición sistemática, en el ámbito de la Sede Central de Arequipa, del efecto del Modelo de Oralidad Civil sobre el producto final del proceso, con base en 167 expedientes con sentencia anulada o revocada, 163 sentencias de vista (105 anuladas) y las series anuales de 2018 y 2024:»</w:t>
             </w:r>
           </w:p>
         </w:tc>
@@ -22478,7 +22478,7 @@
                 <w:sz w:val="15"/>
                 <w:szCs w:val="15"/>
               </w:rPr>
-              <w:t xml:space="preserve">97,1 % de censura y 48,8 % de anulación previa son cifras del corpus anterior. En la muestra actual la censura es casi total en ambos grupos (96,5 % y 97,4 %) porque todos los expedientes son nulos por definición de la muestra, así que no es un resultado comparable.</w:t>
+              <w:t xml:space="preserve">97,1 % de censura y 48,8 % de anulación previa son cifras del corpus anterior. En la muestra actual la censura es casi total en ambos grupos (96,5 % y 97,4 %) porque la muestra está formada solo por expedientes con sentencia anulada o revocada (Tabla 3), así que no es un resultado comparable.</w:t>
             </w:r>
           </w:p>
         </w:tc>

</xml_diff>